<commit_message>
Add professional architecture diagram to report
</commit_message>
<xml_diff>
--- a/deliverables/PyMentor_Tool_Disclosure.docx
+++ b/deliverables/PyMentor_Tool_Disclosure.docx
@@ -468,6 +468,78 @@
               <w:rPr>
                 <w:sz w:val="18"/>
               </w:rPr>
+              <w:t>python-docx</w:t>
+            </w:r>
+          </w:p>
+        </w:tc>
+        <w:tc>
+          <w:tcPr>
+            <w:tcW w:type="dxa" w:w="7060"/>
+            <w:vAlign w:val="center"/>
+          </w:tcPr>
+          <w:p>
+            <w:pPr>
+              <w:spacing w:after="0"/>
+            </w:pPr>
+            <w:r>
+              <w:rPr>
+                <w:sz w:val="18"/>
+              </w:rPr>
+              <w:t>Generates the formatted report and disclosure documents.</w:t>
+            </w:r>
+          </w:p>
+        </w:tc>
+      </w:tr>
+      <w:tr>
+        <w:tc>
+          <w:tcPr>
+            <w:tcW w:type="dxa" w:w="2300"/>
+            <w:vAlign w:val="center"/>
+          </w:tcPr>
+          <w:p>
+            <w:pPr>
+              <w:spacing w:after="0"/>
+            </w:pPr>
+            <w:r>
+              <w:rPr>
+                <w:sz w:val="18"/>
+              </w:rPr>
+              <w:t>Pillow</w:t>
+            </w:r>
+          </w:p>
+        </w:tc>
+        <w:tc>
+          <w:tcPr>
+            <w:tcW w:type="dxa" w:w="7060"/>
+            <w:vAlign w:val="center"/>
+          </w:tcPr>
+          <w:p>
+            <w:pPr>
+              <w:spacing w:after="0"/>
+            </w:pPr>
+            <w:r>
+              <w:rPr>
+                <w:sz w:val="18"/>
+              </w:rPr>
+              <w:t>Renders the system-architecture figure used in the report.</w:t>
+            </w:r>
+          </w:p>
+        </w:tc>
+      </w:tr>
+      <w:tr>
+        <w:tc>
+          <w:tcPr>
+            <w:tcW w:type="dxa" w:w="2300"/>
+            <w:vAlign w:val="center"/>
+          </w:tcPr>
+          <w:p>
+            <w:pPr>
+              <w:spacing w:after="0"/>
+            </w:pPr>
+            <w:r>
+              <w:rPr>
+                <w:sz w:val="18"/>
+              </w:rPr>
               <w:t>Synthetic Python notes</w:t>
             </w:r>
           </w:p>

</xml_diff>